<commit_message>
Update portfolio photos and profile details
</commit_message>
<xml_diff>
--- a/assets/images/Mohmad_Ayman_CV.docx
+++ b/assets/images/Mohmad_Ayman_CV.docx
@@ -1,6 +1,6 @@
 
 <file path=word/document.xml><?xml version="1.0" encoding="utf-8"?>
-<w:document xmlns:wpc="http://schemas.microsoft.com/office/word/2010/wordprocessingCanvas" xmlns:mc="http://schemas.openxmlformats.org/markup-compatibility/2006" xmlns:o="urn:schemas-microsoft-com:office:office" xmlns:r="http://schemas.openxmlformats.org/officeDocument/2006/relationships" xmlns:m="http://schemas.openxmlformats.org/officeDocument/2006/math" xmlns:v="urn:schemas-microsoft-com:vml" xmlns:wp14="http://schemas.microsoft.com/office/word/2010/wordprocessingDrawing" xmlns:wp="http://schemas.openxmlformats.org/drawingml/2006/wordprocessingDrawing" xmlns:w="http://schemas.openxmlformats.org/wordprocessingml/2006/main" xmlns:w14="http://schemas.microsoft.com/office/word/2010/wordml" xmlns:w10="urn:schemas-microsoft-com:office:word" xmlns:w15="http://schemas.microsoft.com/office/word/2012/wordml" xmlns:wpg="http://schemas.microsoft.com/office/word/2010/wordprocessingGroup" xmlns:wpi="http://schemas.microsoft.com/office/word/2010/wordprocessingInk" xmlns:wne="http://schemas.microsoft.com/office/word/2006/wordml" xmlns:wps="http://schemas.microsoft.com/office/word/2010/wordprocessingShape" xmlns:wpsCustomData="http://www.wps.cn/officeDocument/2013/wpsCustomData" mc:Ignorable="w14 w15 wp14">
+<w:document xmlns:wpc="http://schemas.microsoft.com/office/word/2010/wordprocessingCanvas" xmlns:cx="http://schemas.microsoft.com/office/drawing/2014/chartex" xmlns:cx1="http://schemas.microsoft.com/office/drawing/2015/9/8/chartex" xmlns:cx2="http://schemas.microsoft.com/office/drawing/2015/10/21/chartex" xmlns:cx3="http://schemas.microsoft.com/office/drawing/2016/5/9/chartex" xmlns:cx4="http://schemas.microsoft.com/office/drawing/2016/5/10/chartex" xmlns:cx5="http://schemas.microsoft.com/office/drawing/2016/5/11/chartex" xmlns:cx6="http://schemas.microsoft.com/office/drawing/2016/5/12/chartex" xmlns:cx7="http://schemas.microsoft.com/office/drawing/2016/5/13/chartex" xmlns:cx8="http://schemas.microsoft.com/office/drawing/2016/5/14/chartex" xmlns:mc="http://schemas.openxmlformats.org/markup-compatibility/2006" xmlns:o="urn:schemas-microsoft-com:office:office" xmlns:r="http://schemas.openxmlformats.org/officeDocument/2006/relationships" xmlns:m="http://schemas.openxmlformats.org/officeDocument/2006/math" xmlns:v="urn:schemas-microsoft-com:vml" xmlns:wp14="http://schemas.microsoft.com/office/word/2010/wordprocessingDrawing" xmlns:wp="http://schemas.openxmlformats.org/drawingml/2006/wordprocessingDrawing" xmlns:w="http://schemas.openxmlformats.org/wordprocessingml/2006/main" xmlns:w14="http://schemas.microsoft.com/office/word/2010/wordml" xmlns:w10="urn:schemas-microsoft-com:office:word" xmlns:w15="http://schemas.microsoft.com/office/word/2012/wordml" xmlns:wpg="http://schemas.microsoft.com/office/word/2010/wordprocessingGroup" xmlns:wpi="http://schemas.microsoft.com/office/word/2010/wordprocessingInk" xmlns:wne="http://schemas.microsoft.com/office/word/2006/wordml" xmlns:wps="http://schemas.microsoft.com/office/word/2010/wordprocessingShape" xmlns:wpsCustomData="http://www.wps.cn/officeDocument/2013/wpsCustomData" mc:Ignorable="w14 w15 wp14">
   <w:body>
     <w:p>
       <w:pPr>
@@ -68,7 +68,7 @@
     <w:p>
       <w:pPr>
         <w:bidi w:val="0"/>
-        <w:ind w:left="2000" w:leftChars="0" w:firstLine="500" w:firstLineChars="0"/>
+        <w:ind w:left="500" w:leftChars="0" w:firstLine="720" w:firstLineChars="300"/>
         <w:rPr>
           <w:rFonts w:hint="default"/>
           <w:lang w:val="en-US"/>
@@ -80,7 +80,50 @@
           <w:sz w:val="24"/>
           <w:szCs w:val="24"/>
         </w:rPr>
-        <w:t>Aspiring ML Engineer | Computer Science Student</w:t>
+        <w:t xml:space="preserve">Aspiring </w:t>
+      </w:r>
+      <w:r>
+        <w:rPr>
+          <w:rFonts w:hint="default"/>
+          <w:sz w:val="24"/>
+          <w:szCs w:val="24"/>
+          <w:lang w:val="en-US"/>
+        </w:rPr>
+        <w:t xml:space="preserve">Data Science </w:t>
+      </w:r>
+      <w:r>
+        <w:rPr>
+          <w:rFonts w:hint="default"/>
+          <w:sz w:val="24"/>
+          <w:szCs w:val="24"/>
+        </w:rPr>
+        <w:t xml:space="preserve">Engineer | </w:t>
+      </w:r>
+      <w:r>
+        <w:rPr>
+          <w:rFonts w:hint="default" w:ascii="Arial" w:hAnsi="Arial" w:eastAsia="SimSun" w:cs="Arial"/>
+          <w:sz w:val="24"/>
+          <w:szCs w:val="24"/>
+        </w:rPr>
+        <w:t>Final-Year</w:t>
+      </w:r>
+      <w:r>
+        <w:rPr>
+          <w:rFonts w:hint="default" w:ascii="Arial" w:hAnsi="Arial" w:eastAsia="SimSun" w:cs="Arial"/>
+          <w:sz w:val="24"/>
+          <w:szCs w:val="24"/>
+          <w:rtl/>
+          <w:lang w:val="en-US" w:bidi="ar-EG"/>
+        </w:rPr>
+        <w:t xml:space="preserve"> </w:t>
+      </w:r>
+      <w:r>
+        <w:rPr>
+          <w:rFonts w:hint="default"/>
+          <w:sz w:val="24"/>
+          <w:szCs w:val="24"/>
+        </w:rPr>
+        <w:t>Computer Science Student</w:t>
       </w:r>
     </w:p>
     <w:p>
@@ -140,7 +183,7 @@
           <w:szCs w:val="18"/>
           <w:lang w:val="en-US"/>
         </w:rPr>
-        <w:t>I</w:t>
+        <w:t>i</w:t>
       </w:r>
       <w:r>
         <w:rPr>
@@ -202,41 +245,61 @@
     <w:p>
       <w:pPr>
         <w:pStyle w:val="18"/>
-        <w:bidi w:val="0"/>
-        <w:rPr>
-          <w:rFonts w:hint="default"/>
-        </w:rPr>
-      </w:pPr>
-      <w:r>
-        <w:rPr>
-          <w:rFonts w:hint="default"/>
-          <w:sz w:val="20"/>
-          <w:szCs w:val="20"/>
-        </w:rPr>
-        <w:t>Passionate 3rd-year Computer Science student with hands-on experience building end-to-end AI systems including NLP, Computer Vision, Multimodal AI, and RAG pipelines. Completed multiple certifications in Data Analysis, Data Science, and AI from NTI</w:t>
-      </w:r>
-      <w:r>
-        <w:rPr>
-          <w:rFonts w:hint="default"/>
-          <w:sz w:val="20"/>
-          <w:szCs w:val="20"/>
-          <w:lang w:val="en-US"/>
-        </w:rPr>
-        <w:t xml:space="preserve"> </w:t>
-      </w:r>
-      <w:r>
-        <w:rPr>
-          <w:rFonts w:hint="default"/>
-          <w:sz w:val="20"/>
-          <w:szCs w:val="20"/>
-        </w:rPr>
-        <w:t>, Route, and NVIDIA. Currently pursuing NVQ Level 3 in Data Science at Helwan National University. Eager to apply technical skills to real-world problems</w:t>
-      </w:r>
-      <w:r>
-        <w:rPr>
-          <w:rFonts w:hint="default"/>
-        </w:rPr>
-        <w:t>.</w:t>
+        <w:keepNext w:val="0"/>
+        <w:keepLines w:val="0"/>
+        <w:widowControl/>
+        <w:suppressLineNumbers w:val="0"/>
+        <w:rPr>
+          <w:b w:val="0"/>
+          <w:bCs w:val="0"/>
+          <w:sz w:val="20"/>
+          <w:szCs w:val="20"/>
+        </w:rPr>
+      </w:pPr>
+      <w:r>
+        <w:rPr>
+          <w:rStyle w:val="19"/>
+          <w:b w:val="0"/>
+          <w:bCs w:val="0"/>
+          <w:sz w:val="20"/>
+          <w:szCs w:val="20"/>
+        </w:rPr>
+        <w:t>Final-year Computer Science student specializing in Data Science, with hands-on experience building end-to-end AI systems including NLP, Computer Vision, Mult</w:t>
+      </w:r>
+      <w:bookmarkStart w:id="0" w:name="_GoBack"/>
+      <w:bookmarkEnd w:id="0"/>
+      <w:r>
+        <w:rPr>
+          <w:rStyle w:val="19"/>
+          <w:b w:val="0"/>
+          <w:bCs w:val="0"/>
+          <w:sz w:val="20"/>
+          <w:szCs w:val="20"/>
+        </w:rPr>
+        <w:t>imodal AI, and RAG pipelines. Completed multiple certifications in Data Analysis, Data Science, and AI from NTI, Route Academy, and NVIDIA. Eager to apply technical skills to real-world AI and data</w:t>
+      </w:r>
+      <w:r>
+        <w:rPr>
+          <w:rStyle w:val="19"/>
+          <w:rFonts w:hint="cs" w:cs="Times New Roman"/>
+          <w:b w:val="0"/>
+          <w:bCs w:val="0"/>
+          <w:sz w:val="20"/>
+          <w:szCs w:val="20"/>
+          <w:rtl/>
+          <w:lang w:val="en-US" w:bidi="ar-EG"/>
+        </w:rPr>
+        <w:t>-</w:t>
+      </w:r>
+      <w:r>
+        <w:rPr>
+          <w:rStyle w:val="19"/>
+          <w:b w:val="0"/>
+          <w:bCs w:val="0"/>
+          <w:sz w:val="20"/>
+          <w:szCs w:val="20"/>
+        </w:rPr>
+        <w:t>driven problems.</w:t>
       </w:r>
     </w:p>
     <w:p>
@@ -268,12 +331,12 @@
           <w:sz w:val="20"/>
           <w:szCs w:val="20"/>
         </w:rPr>
-        <w:t>Programming &amp; Core</w:t>
-      </w:r>
-    </w:p>
-    <w:p>
-      <w:pPr>
-        <w:pStyle w:val="20"/>
+        <w:t>Programming &amp; Fundamentals</w:t>
+      </w:r>
+    </w:p>
+    <w:p>
+      <w:pPr>
+        <w:pStyle w:val="21"/>
         <w:numPr>
           <w:ilvl w:val="0"/>
           <w:numId w:val="1"/>
@@ -287,81 +350,12 @@
           <w:sz w:val="20"/>
           <w:szCs w:val="20"/>
         </w:rPr>
-        <w:t>Python, Java, C,</w:t>
-      </w:r>
-      <w:r>
-        <w:rPr>
-          <w:rFonts w:hint="default" w:cs="Arial"/>
-          <w:color w:val="1C1C1C"/>
-          <w:sz w:val="20"/>
-          <w:szCs w:val="20"/>
-          <w:lang w:val="en-US"/>
-        </w:rPr>
-        <w:t xml:space="preserve"> C++,</w:t>
-      </w:r>
-      <w:r>
-        <w:rPr>
-          <w:rFonts w:ascii="Arial" w:hAnsi="Arial" w:eastAsia="Arial" w:cs="Arial"/>
-          <w:color w:val="1C1C1C"/>
-          <w:sz w:val="20"/>
-          <w:szCs w:val="20"/>
-        </w:rPr>
-        <w:t xml:space="preserve"> </w:t>
-      </w:r>
-      <w:r>
-        <w:rPr>
-          <w:rFonts w:hint="default" w:cs="Arial"/>
-          <w:color w:val="1C1C1C"/>
-          <w:sz w:val="20"/>
-          <w:szCs w:val="20"/>
-          <w:lang w:val="en-US"/>
-        </w:rPr>
-        <w:t>R, J</w:t>
-      </w:r>
-      <w:r>
-        <w:rPr>
-          <w:rFonts w:ascii="Arial" w:hAnsi="Arial" w:eastAsia="Arial" w:cs="Arial"/>
-          <w:color w:val="1C1C1C"/>
-          <w:sz w:val="20"/>
-          <w:szCs w:val="20"/>
-        </w:rPr>
-        <w:t>avaScript</w:t>
-      </w:r>
-      <w:r>
-        <w:rPr>
-          <w:rFonts w:hint="default" w:eastAsia="SimSun" w:cs="Arial"/>
-          <w:sz w:val="20"/>
-          <w:szCs w:val="20"/>
-          <w:lang w:val="en-US"/>
-        </w:rPr>
-        <w:t xml:space="preserve">, </w:t>
-      </w:r>
-      <w:r>
-        <w:rPr>
-          <w:rFonts w:hint="default"/>
-          <w:lang w:val="en-US"/>
-        </w:rPr>
-        <w:t>HTML ,</w:t>
-      </w:r>
-      <w:r>
-        <w:rPr>
-          <w:rFonts w:hint="cs" w:cs="Arial"/>
-          <w:rtl/>
-          <w:lang w:val="en-US" w:bidi="ar-EG"/>
-        </w:rPr>
-        <w:t xml:space="preserve"> </w:t>
-      </w:r>
-      <w:r>
-        <w:rPr>
-          <w:rFonts w:hint="default"/>
-          <w:lang w:val="en-US"/>
-        </w:rPr>
-        <w:t xml:space="preserve">CSS </w:t>
-      </w:r>
-    </w:p>
-    <w:p>
-      <w:pPr>
-        <w:pStyle w:val="20"/>
+        <w:t>Python, SQL, Java, C, C++, R</w:t>
+      </w:r>
+    </w:p>
+    <w:p>
+      <w:pPr>
+        <w:pStyle w:val="21"/>
         <w:numPr>
           <w:ilvl w:val="0"/>
           <w:numId w:val="1"/>
@@ -375,22 +369,25 @@
           <w:sz w:val="20"/>
           <w:szCs w:val="20"/>
         </w:rPr>
-        <w:t xml:space="preserve">SQL, </w:t>
-      </w:r>
-      <w:r>
-        <w:rPr>
-          <w:rFonts w:hint="default" w:cs="Arial"/>
-          <w:color w:val="1C1C1C"/>
-          <w:sz w:val="20"/>
-          <w:szCs w:val="20"/>
-          <w:lang w:val="en-US"/>
-        </w:rPr>
-        <w:t>NoSQL</w:t>
-      </w:r>
-    </w:p>
-    <w:p>
-      <w:pPr>
-        <w:pStyle w:val="20"/>
+        <w:t>Object-Oriented Programming, Data Structures &amp; Algorithms</w:t>
+      </w:r>
+    </w:p>
+    <w:p>
+      <w:r>
+        <w:rPr>
+          <w:rFonts w:ascii="Arial" w:hAnsi="Arial" w:eastAsia="Arial" w:cs="Arial"/>
+          <w:b/>
+          <w:bCs/>
+          <w:color w:val="1A5276"/>
+          <w:sz w:val="20"/>
+          <w:szCs w:val="20"/>
+        </w:rPr>
+        <w:t>Machine Learning &amp; Deep Learning</w:t>
+      </w:r>
+    </w:p>
+    <w:p>
+      <w:pPr>
+        <w:pStyle w:val="21"/>
         <w:numPr>
           <w:ilvl w:val="0"/>
           <w:numId w:val="1"/>
@@ -404,56 +401,31 @@
           <w:sz w:val="20"/>
           <w:szCs w:val="20"/>
         </w:rPr>
-        <w:t>Object-Oriented Programming</w:t>
-      </w:r>
-    </w:p>
-    <w:p>
-      <w:pPr>
-        <w:pStyle w:val="20"/>
+        <w:t>PyTorch, TensorFlow, Keras, Scikit-learn</w:t>
+      </w:r>
+    </w:p>
+    <w:p>
+      <w:pPr>
+        <w:pStyle w:val="21"/>
         <w:numPr>
           <w:ilvl w:val="0"/>
           <w:numId w:val="1"/>
         </w:numPr>
         <w:spacing w:before="40" w:after="40"/>
-        <w:rPr>
-          <w:rFonts w:hint="default"/>
-          <w:lang w:val="en-US"/>
-        </w:rPr>
-      </w:pPr>
-      <w:r>
-        <w:rPr>
-          <w:rFonts w:hint="default" w:ascii="Arial" w:hAnsi="Arial" w:eastAsia="SimSun" w:cs="Arial"/>
-          <w:sz w:val="20"/>
-          <w:szCs w:val="20"/>
-        </w:rPr>
-        <w:t>Algorithms &amp; Data Structures</w:t>
-      </w:r>
-      <w:r>
-        <w:rPr>
-          <w:rFonts w:hint="default" w:eastAsia="SimSun" w:cs="Arial"/>
-          <w:sz w:val="20"/>
-          <w:szCs w:val="20"/>
-          <w:lang w:val="en-US"/>
-        </w:rPr>
-        <w:t xml:space="preserve"> </w:t>
-      </w:r>
-    </w:p>
-    <w:p>
-      <w:r>
-        <w:rPr>
-          <w:rFonts w:ascii="Arial" w:hAnsi="Arial" w:eastAsia="Arial" w:cs="Arial"/>
-          <w:b/>
-          <w:bCs/>
-          <w:color w:val="1A5276"/>
-          <w:sz w:val="20"/>
-          <w:szCs w:val="20"/>
-        </w:rPr>
-        <w:t>AI / ML Frameworks</w:t>
-      </w:r>
-    </w:p>
-    <w:p>
-      <w:pPr>
-        <w:pStyle w:val="20"/>
+      </w:pPr>
+      <w:r>
+        <w:rPr>
+          <w:rFonts w:ascii="Arial" w:hAnsi="Arial" w:eastAsia="Arial" w:cs="Arial"/>
+          <w:color w:val="1C1C1C"/>
+          <w:sz w:val="20"/>
+          <w:szCs w:val="20"/>
+        </w:rPr>
+        <w:t>NLP: Transformers, BERT, LSTM, GRU</w:t>
+      </w:r>
+    </w:p>
+    <w:p>
+      <w:pPr>
+        <w:pStyle w:val="21"/>
         <w:numPr>
           <w:ilvl w:val="0"/>
           <w:numId w:val="1"/>
@@ -467,12 +439,12 @@
           <w:sz w:val="20"/>
           <w:szCs w:val="20"/>
         </w:rPr>
-        <w:t>TensorFlow, PyTorch, Keras</w:t>
-      </w:r>
-    </w:p>
-    <w:p>
-      <w:pPr>
-        <w:pStyle w:val="20"/>
+        <w:t>Computer Vision: OpenCV, YOLOv8, MediaPipe</w:t>
+      </w:r>
+    </w:p>
+    <w:p>
+      <w:pPr>
+        <w:pStyle w:val="21"/>
         <w:numPr>
           <w:ilvl w:val="0"/>
           <w:numId w:val="1"/>
@@ -486,142 +458,95 @@
           <w:sz w:val="20"/>
           <w:szCs w:val="20"/>
         </w:rPr>
-        <w:t>Scikit-learn</w:t>
-      </w:r>
-    </w:p>
-    <w:p>
-      <w:pPr>
-        <w:pStyle w:val="20"/>
+        <w:t>Multimodal AI</w:t>
+      </w:r>
+    </w:p>
+    <w:p>
+      <w:r>
+        <w:rPr>
+          <w:rFonts w:ascii="Arial" w:hAnsi="Arial" w:eastAsia="Arial" w:cs="Arial"/>
+          <w:b/>
+          <w:bCs/>
+          <w:color w:val="1A5276"/>
+          <w:sz w:val="20"/>
+          <w:szCs w:val="20"/>
+        </w:rPr>
+        <w:t>Generative AI &amp; RAG</w:t>
+      </w:r>
+    </w:p>
+    <w:p>
+      <w:pPr>
+        <w:pStyle w:val="21"/>
         <w:numPr>
           <w:ilvl w:val="0"/>
           <w:numId w:val="1"/>
         </w:numPr>
         <w:spacing w:before="40" w:after="40"/>
-        <w:rPr>
-          <w:rFonts w:hint="default" w:cs="Arial"/>
-          <w:color w:val="1C1C1C"/>
-          <w:sz w:val="20"/>
-          <w:szCs w:val="20"/>
-          <w:lang w:val="en-US"/>
-        </w:rPr>
-      </w:pPr>
-      <w:r>
-        <w:rPr>
-          <w:rFonts w:ascii="Arial" w:hAnsi="Arial" w:eastAsia="Arial" w:cs="Arial"/>
-          <w:color w:val="1C1C1C"/>
-          <w:sz w:val="20"/>
-          <w:szCs w:val="20"/>
-        </w:rPr>
-        <w:t>LangChain, ChromaDB</w:t>
-      </w:r>
-      <w:r>
-        <w:rPr>
-          <w:rFonts w:hint="default" w:cs="Arial"/>
-          <w:color w:val="1C1C1C"/>
-          <w:sz w:val="20"/>
-          <w:szCs w:val="20"/>
-          <w:lang w:val="en-US" w:bidi="ar-SA"/>
-        </w:rPr>
-        <w:t>, DuckDB</w:t>
-      </w:r>
-      <w:r>
-        <w:rPr>
-          <w:rFonts w:hint="default" w:cs="Arial"/>
-          <w:color w:val="1C1C1C"/>
-          <w:sz w:val="20"/>
-          <w:szCs w:val="20"/>
-          <w:rtl w:val="0"/>
-          <w:lang w:val="en-US" w:bidi="ar-SA"/>
-        </w:rPr>
-        <w:t xml:space="preserve">,  Llama-Index, </w:t>
-      </w:r>
-      <w:r>
-        <w:rPr>
-          <w:rFonts w:hint="default" w:cs="Arial"/>
-          <w:color w:val="1C1C1C"/>
-          <w:sz w:val="20"/>
-          <w:szCs w:val="20"/>
-          <w:lang w:val="en-US"/>
-        </w:rPr>
-        <w:t>FastAPI</w:t>
-      </w:r>
-    </w:p>
-    <w:p>
-      <w:pPr>
-        <w:pStyle w:val="20"/>
+      </w:pPr>
+      <w:r>
+        <w:rPr>
+          <w:rFonts w:ascii="Arial" w:hAnsi="Arial" w:eastAsia="Arial" w:cs="Arial"/>
+          <w:color w:val="1C1C1C"/>
+          <w:sz w:val="20"/>
+          <w:szCs w:val="20"/>
+        </w:rPr>
+        <w:t>LLMs, RAG, LangChain, LlamaIndex, ChromaDB, Ollama</w:t>
+      </w:r>
+    </w:p>
+    <w:p>
+      <w:r>
+        <w:rPr>
+          <w:rFonts w:ascii="Arial" w:hAnsi="Arial" w:eastAsia="Arial" w:cs="Arial"/>
+          <w:b/>
+          <w:bCs/>
+          <w:color w:val="1A5276"/>
+          <w:sz w:val="20"/>
+          <w:szCs w:val="20"/>
+        </w:rPr>
+        <w:t>Data, Databases &amp; Deployment</w:t>
+      </w:r>
+    </w:p>
+    <w:p>
+      <w:pPr>
+        <w:pStyle w:val="21"/>
         <w:numPr>
           <w:ilvl w:val="0"/>
           <w:numId w:val="1"/>
         </w:numPr>
         <w:spacing w:before="40" w:after="40"/>
-        <w:rPr>
-          <w:rFonts w:hint="default" w:cs="Arial"/>
-          <w:color w:val="1C1C1C"/>
-          <w:sz w:val="20"/>
-          <w:szCs w:val="20"/>
-          <w:lang w:val="en-US"/>
-        </w:rPr>
-      </w:pPr>
-      <w:r>
-        <w:rPr>
-          <w:rFonts w:hint="default" w:ascii="Arial" w:hAnsi="Arial" w:eastAsia="SimSun" w:cs="Arial"/>
-          <w:sz w:val="20"/>
-          <w:szCs w:val="20"/>
-        </w:rPr>
-        <w:t>OpenCV</w:t>
-      </w:r>
-      <w:r>
-        <w:rPr>
-          <w:rFonts w:hint="default" w:ascii="Arial" w:hAnsi="Arial" w:eastAsia="SimSun" w:cs="Arial"/>
-          <w:sz w:val="20"/>
-          <w:szCs w:val="20"/>
-          <w:rtl/>
-          <w:lang w:val="en-US" w:bidi="ar-SA"/>
-        </w:rPr>
-        <w:t xml:space="preserve"> </w:t>
-      </w:r>
-    </w:p>
-    <w:p>
-      <w:pPr>
-        <w:pStyle w:val="20"/>
+      </w:pPr>
+      <w:r>
+        <w:rPr>
+          <w:rFonts w:ascii="Arial" w:hAnsi="Arial" w:eastAsia="Arial" w:cs="Arial"/>
+          <w:color w:val="1C1C1C"/>
+          <w:sz w:val="20"/>
+          <w:szCs w:val="20"/>
+        </w:rPr>
+        <w:t>Pandas, Excel, Power BI</w:t>
+      </w:r>
+    </w:p>
+    <w:p>
+      <w:pPr>
+        <w:pStyle w:val="21"/>
         <w:numPr>
           <w:ilvl w:val="0"/>
           <w:numId w:val="1"/>
         </w:numPr>
         <w:spacing w:before="40" w:after="40"/>
-        <w:rPr>
-          <w:rFonts w:hint="default" w:ascii="Arial" w:hAnsi="Arial" w:cs="Arial"/>
-          <w:color w:val="1C1C1C"/>
-          <w:sz w:val="20"/>
-          <w:szCs w:val="20"/>
-          <w:lang w:val="en-US"/>
-        </w:rPr>
-      </w:pPr>
-      <w:r>
-        <w:rPr>
-          <w:rFonts w:hint="default" w:ascii="Arial" w:hAnsi="Arial" w:eastAsia="SimSun" w:cs="Arial"/>
-          <w:sz w:val="20"/>
-          <w:szCs w:val="20"/>
-        </w:rPr>
-        <w:t>MediaPipe</w:t>
-      </w:r>
-    </w:p>
-    <w:p>
-      <w:r>
-        <w:rPr>
-          <w:rFonts w:ascii="Arial" w:hAnsi="Arial" w:eastAsia="Arial" w:cs="Arial"/>
-          <w:b/>
-          <w:bCs/>
-          <w:color w:val="1A5276"/>
-          <w:sz w:val="20"/>
-          <w:szCs w:val="20"/>
-        </w:rPr>
-        <w:t>Deep Learning Specializations</w:t>
-      </w:r>
-    </w:p>
-    <w:p>
-      <w:pPr>
-        <w:pStyle w:val="20"/>
+      </w:pPr>
+      <w:r>
+        <w:rPr>
+          <w:rFonts w:ascii="Arial" w:hAnsi="Arial" w:eastAsia="Arial" w:cs="Arial"/>
+          <w:color w:val="1C1C1C"/>
+          <w:sz w:val="20"/>
+          <w:szCs w:val="20"/>
+        </w:rPr>
+        <w:t>DuckDB, MySQL, SQLite, MongoDB</w:t>
+      </w:r>
+    </w:p>
+    <w:p>
+      <w:pPr>
+        <w:pStyle w:val="21"/>
         <w:numPr>
           <w:ilvl w:val="0"/>
           <w:numId w:val="1"/>
@@ -635,54 +560,12 @@
           <w:sz w:val="20"/>
           <w:szCs w:val="20"/>
         </w:rPr>
-        <w:t>NLP: BERT, Transform</w:t>
-      </w:r>
-      <w:bookmarkStart w:id="0" w:name="_GoBack"/>
-      <w:bookmarkEnd w:id="0"/>
-      <w:r>
-        <w:rPr>
-          <w:rFonts w:ascii="Arial" w:hAnsi="Arial" w:eastAsia="Arial" w:cs="Arial"/>
-          <w:color w:val="1C1C1C"/>
-          <w:sz w:val="20"/>
-          <w:szCs w:val="20"/>
-        </w:rPr>
-        <w:t>ers, LSTM, RNN</w:t>
-      </w:r>
-      <w:r>
-        <w:rPr>
-          <w:rFonts w:hint="default" w:cs="Arial"/>
-          <w:color w:val="1C1C1C"/>
-          <w:sz w:val="20"/>
-          <w:szCs w:val="20"/>
-          <w:lang w:val="en-US"/>
-        </w:rPr>
-        <w:t>,</w:t>
-      </w:r>
-      <w:r>
-        <w:rPr>
-          <w:rFonts w:hint="cs" w:cs="Arial"/>
-          <w:color w:val="1C1C1C"/>
-          <w:sz w:val="20"/>
-          <w:szCs w:val="20"/>
-          <w:rtl/>
-          <w:lang w:val="en-US" w:bidi="ar-EG"/>
-        </w:rPr>
-        <w:t xml:space="preserve"> </w:t>
-      </w:r>
-      <w:r>
-        <w:rPr>
-          <w:rFonts w:hint="default" w:cs="Arial"/>
-          <w:color w:val="1C1C1C"/>
-          <w:sz w:val="20"/>
-          <w:szCs w:val="20"/>
-          <w:lang w:val="en-US"/>
-        </w:rPr>
-        <w:t>GRU, LLM</w:t>
-      </w:r>
-    </w:p>
-    <w:p>
-      <w:pPr>
-        <w:pStyle w:val="20"/>
+        <w:t>FastAPI, Flask, Streamlit, Docker</w:t>
+      </w:r>
+    </w:p>
+    <w:p>
+      <w:pPr>
+        <w:pStyle w:val="21"/>
         <w:numPr>
           <w:ilvl w:val="0"/>
           <w:numId w:val="1"/>
@@ -696,261 +579,7 @@
           <w:sz w:val="20"/>
           <w:szCs w:val="20"/>
         </w:rPr>
-        <w:t>Computer Vision, Object Detection (YOLOv8)</w:t>
-      </w:r>
-    </w:p>
-    <w:p>
-      <w:pPr>
-        <w:pStyle w:val="20"/>
-        <w:numPr>
-          <w:ilvl w:val="0"/>
-          <w:numId w:val="1"/>
-        </w:numPr>
-        <w:spacing w:before="40" w:after="40"/>
-      </w:pPr>
-      <w:r>
-        <w:rPr>
-          <w:rFonts w:ascii="Arial" w:hAnsi="Arial" w:eastAsia="Arial" w:cs="Arial"/>
-          <w:color w:val="1C1C1C"/>
-          <w:sz w:val="20"/>
-          <w:szCs w:val="20"/>
-        </w:rPr>
-        <w:t>Multimodal Fusion Layers</w:t>
-      </w:r>
-    </w:p>
-    <w:p>
-      <w:pPr>
-        <w:pStyle w:val="20"/>
-        <w:numPr>
-          <w:ilvl w:val="0"/>
-          <w:numId w:val="1"/>
-        </w:numPr>
-        <w:spacing w:before="40" w:after="40"/>
-        <w:rPr>
-          <w:rFonts w:hint="default" w:ascii="Arial" w:hAnsi="Arial" w:eastAsia="SimSun" w:cs="Arial"/>
-          <w:b w:val="0"/>
-          <w:bCs w:val="0"/>
-          <w:sz w:val="20"/>
-          <w:szCs w:val="20"/>
-          <w:lang w:val="en-US"/>
-        </w:rPr>
-      </w:pPr>
-      <w:r>
-        <w:rPr>
-          <w:rFonts w:ascii="Arial" w:hAnsi="Arial" w:eastAsia="Arial" w:cs="Arial"/>
-          <w:color w:val="1C1C1C"/>
-          <w:sz w:val="20"/>
-          <w:szCs w:val="20"/>
-        </w:rPr>
-        <w:t>RAG Systems</w:t>
-      </w:r>
-    </w:p>
-    <w:p>
-      <w:pPr>
-        <w:pStyle w:val="20"/>
-        <w:numPr>
-          <w:ilvl w:val="0"/>
-          <w:numId w:val="1"/>
-        </w:numPr>
-        <w:spacing w:before="40" w:after="40"/>
-        <w:rPr>
-          <w:rFonts w:hint="default" w:ascii="Arial" w:hAnsi="Arial" w:eastAsia="SimSun" w:cs="Arial"/>
-          <w:b w:val="0"/>
-          <w:bCs w:val="0"/>
-          <w:sz w:val="20"/>
-          <w:szCs w:val="20"/>
-          <w:lang w:val="en-US"/>
-        </w:rPr>
-      </w:pPr>
-      <w:r>
-        <w:rPr>
-          <w:rFonts w:hint="default"/>
-          <w:lang w:val="en-US"/>
-        </w:rPr>
-        <w:t xml:space="preserve">Scraping Data </w:t>
-      </w:r>
-      <w:r>
-        <w:rPr>
-          <w:rFonts w:hint="default" w:ascii="Arial" w:hAnsi="Arial" w:eastAsia="SimSun" w:cs="Arial"/>
-          <w:b w:val="0"/>
-          <w:bCs w:val="0"/>
-          <w:sz w:val="20"/>
-          <w:szCs w:val="20"/>
-          <w:lang w:val="en-US"/>
-        </w:rPr>
-        <w:t>(</w:t>
-      </w:r>
-      <w:r>
-        <w:rPr>
-          <w:rFonts w:hint="default" w:ascii="Arial" w:hAnsi="Arial" w:eastAsia="SimSun" w:cs="Arial"/>
-          <w:b w:val="0"/>
-          <w:bCs w:val="0"/>
-          <w:sz w:val="20"/>
-          <w:szCs w:val="20"/>
-        </w:rPr>
-        <w:t>Scrapy</w:t>
-      </w:r>
-      <w:r>
-        <w:rPr>
-          <w:rFonts w:hint="default" w:ascii="Arial" w:hAnsi="Arial" w:eastAsia="SimSun" w:cs="Arial"/>
-          <w:b w:val="0"/>
-          <w:bCs w:val="0"/>
-          <w:sz w:val="20"/>
-          <w:szCs w:val="20"/>
-          <w:lang w:val="en-US"/>
-        </w:rPr>
-        <w:t xml:space="preserve"> ,</w:t>
-      </w:r>
-      <w:r>
-        <w:rPr>
-          <w:rFonts w:hint="default" w:eastAsia="SimSun" w:cs="Arial"/>
-          <w:b w:val="0"/>
-          <w:bCs w:val="0"/>
-          <w:sz w:val="20"/>
-          <w:szCs w:val="20"/>
-          <w:lang w:val="en-US"/>
-        </w:rPr>
-        <w:t xml:space="preserve"> </w:t>
-      </w:r>
-      <w:r>
-        <w:rPr>
-          <w:rFonts w:hint="default" w:ascii="Arial" w:hAnsi="Arial" w:eastAsia="SimSun" w:cs="Arial"/>
-          <w:b w:val="0"/>
-          <w:bCs w:val="0"/>
-          <w:sz w:val="20"/>
-          <w:szCs w:val="20"/>
-        </w:rPr>
-        <w:t>BeautifulSoup</w:t>
-      </w:r>
-      <w:r>
-        <w:rPr>
-          <w:rFonts w:hint="default" w:ascii="Arial" w:hAnsi="Arial" w:eastAsia="SimSun" w:cs="Arial"/>
-          <w:b w:val="0"/>
-          <w:bCs w:val="0"/>
-          <w:sz w:val="20"/>
-          <w:szCs w:val="20"/>
-          <w:lang w:val="en-US"/>
-        </w:rPr>
-        <w:t>)</w:t>
-      </w:r>
-    </w:p>
-    <w:p>
-      <w:r>
-        <w:rPr>
-          <w:rFonts w:ascii="Arial" w:hAnsi="Arial" w:eastAsia="Arial" w:cs="Arial"/>
-          <w:b/>
-          <w:bCs/>
-          <w:color w:val="1A5276"/>
-          <w:sz w:val="20"/>
-          <w:szCs w:val="20"/>
-        </w:rPr>
-        <w:t>Data &amp; Infrastructure</w:t>
-      </w:r>
-    </w:p>
-    <w:p>
-      <w:pPr>
-        <w:pStyle w:val="20"/>
-        <w:numPr>
-          <w:ilvl w:val="0"/>
-          <w:numId w:val="1"/>
-        </w:numPr>
-        <w:spacing w:before="40" w:after="40"/>
-      </w:pPr>
-      <w:r>
-        <w:rPr>
-          <w:rFonts w:ascii="Arial" w:hAnsi="Arial" w:eastAsia="Arial" w:cs="Arial"/>
-          <w:color w:val="1C1C1C"/>
-          <w:sz w:val="20"/>
-          <w:szCs w:val="20"/>
-        </w:rPr>
-        <w:t>Power BI, Excel</w:t>
-      </w:r>
-    </w:p>
-    <w:p>
-      <w:pPr>
-        <w:pStyle w:val="20"/>
-        <w:numPr>
-          <w:ilvl w:val="0"/>
-          <w:numId w:val="1"/>
-        </w:numPr>
-        <w:spacing w:before="40" w:after="40"/>
-      </w:pPr>
-      <w:r>
-        <w:rPr>
-          <w:rFonts w:hint="default"/>
-          <w:lang w:val="en-US"/>
-        </w:rPr>
-        <w:t>MySQL,</w:t>
-      </w:r>
-      <w:r>
-        <w:rPr>
-          <w:rFonts w:hint="cs" w:cs="Arial"/>
-          <w:rtl/>
-          <w:lang w:val="en-US" w:bidi="ar-EG"/>
-        </w:rPr>
-        <w:t xml:space="preserve"> </w:t>
-      </w:r>
-      <w:r>
-        <w:rPr>
-          <w:rFonts w:hint="default"/>
-          <w:lang w:val="en-US"/>
-        </w:rPr>
-        <w:t>SQLite</w:t>
-      </w:r>
-    </w:p>
-    <w:p>
-      <w:pPr>
-        <w:pStyle w:val="20"/>
-        <w:numPr>
-          <w:ilvl w:val="0"/>
-          <w:numId w:val="1"/>
-        </w:numPr>
-        <w:spacing w:before="40" w:after="40"/>
-      </w:pPr>
-      <w:r>
-        <w:rPr>
-          <w:rFonts w:ascii="Arial" w:hAnsi="Arial" w:eastAsia="Arial" w:cs="Arial"/>
-          <w:color w:val="1C1C1C"/>
-          <w:sz w:val="20"/>
-          <w:szCs w:val="20"/>
-        </w:rPr>
-        <w:t>MongoDB, MongoDB Atlas</w:t>
-      </w:r>
-    </w:p>
-    <w:p>
-      <w:pPr>
-        <w:pStyle w:val="20"/>
-        <w:numPr>
-          <w:ilvl w:val="0"/>
-          <w:numId w:val="1"/>
-        </w:numPr>
-        <w:spacing w:before="40" w:after="40"/>
-      </w:pPr>
-      <w:r>
-        <w:rPr>
-          <w:rFonts w:ascii="Arial" w:hAnsi="Arial" w:eastAsia="Arial" w:cs="Arial"/>
-          <w:color w:val="1C1C1C"/>
-          <w:sz w:val="20"/>
-          <w:szCs w:val="20"/>
-        </w:rPr>
-        <w:t>Big Data, MapReduce</w:t>
-      </w:r>
-    </w:p>
-    <w:p>
-      <w:pPr>
-        <w:pStyle w:val="20"/>
-        <w:numPr>
-          <w:ilvl w:val="0"/>
-          <w:numId w:val="1"/>
-        </w:numPr>
-        <w:spacing w:before="40" w:after="40"/>
-      </w:pPr>
-      <w:r>
-        <w:rPr>
-          <w:rFonts w:hint="default"/>
-          <w:lang w:val="en-US"/>
-        </w:rPr>
-        <w:t>Docker</w:t>
+        <w:t>Web Scraping: Scrapy, BeautifulSoup</w:t>
       </w:r>
     </w:p>
     <w:p>
@@ -1060,7 +689,7 @@
           <w:sz w:val="18"/>
           <w:szCs w:val="18"/>
         </w:rPr>
-        <w:t>Built a local AI data assistant that allows users to ask data questions in English or Arabic instead of writing SQL manually.</w:t>
+        <w:t>Built a local AI assistant for answering English and Arabic questions over e-commerce, CSV, and Excel data without external AI APIs.</w:t>
       </w:r>
     </w:p>
     <w:p>
@@ -1089,7 +718,7 @@
           <w:sz w:val="18"/>
           <w:szCs w:val="18"/>
         </w:rPr>
-        <w:t>Implemented a safe Text-to-SQL pipeline using a local LLM through Ollama, DuckDB execution, and SQLGlot AST validation.</w:t>
+        <w:t>Developed a Text-to-SQL pipeline using exact-schema retrieval, SQLGlot AST validation, read-only DuckDB execution, and automatic SQL repair.</w:t>
       </w:r>
     </w:p>
     <w:p>
@@ -1118,7 +747,7 @@
           <w:sz w:val="18"/>
           <w:szCs w:val="18"/>
         </w:rPr>
-        <w:t>Created semantic business views and a TF-IDF schema retriever to send only the most relevant tables and columns to the model.</w:t>
+        <w:t>Created semantic business views and automatic routing for text answers, data tables, and interactive Plotly charts.</w:t>
       </w:r>
     </w:p>
     <w:p>
@@ -1134,93 +763,6 @@
         <w:suppressLineNumbers w:val="0"/>
         <w:ind w:left="360" w:leftChars="0" w:hanging="240" w:firstLineChars="0"/>
         <w:rPr>
-          <w:rStyle w:val="15"/>
-          <w:rFonts w:hint="default" w:ascii="Arial" w:hAnsi="Arial" w:cs="Arial"/>
-          <w:sz w:val="18"/>
-          <w:szCs w:val="18"/>
-        </w:rPr>
-      </w:pPr>
-      <w:r>
-        <w:rPr>
-          <w:rStyle w:val="15"/>
-          <w:rFonts w:hint="default" w:ascii="Arial" w:hAnsi="Arial" w:cs="Arial"/>
-          <w:sz w:val="18"/>
-          <w:szCs w:val="18"/>
-        </w:rPr>
-        <w:t>Added support for CSV and Excel uploads, including automatic table/column cleaning, schema preview, and in-memory DuckDB registration.</w:t>
-      </w:r>
-    </w:p>
-    <w:p>
-      <w:pPr>
-        <w:pStyle w:val="16"/>
-        <w:keepNext w:val="0"/>
-        <w:keepLines w:val="0"/>
-        <w:widowControl/>
-        <w:numPr>
-          <w:ilvl w:val="0"/>
-          <w:numId w:val="2"/>
-        </w:numPr>
-        <w:suppressLineNumbers w:val="0"/>
-        <w:ind w:left="360" w:leftChars="0" w:hanging="240" w:firstLineChars="0"/>
-        <w:rPr>
-          <w:rStyle w:val="15"/>
-          <w:rFonts w:hint="default" w:ascii="Arial" w:hAnsi="Arial" w:cs="Arial"/>
-          <w:sz w:val="18"/>
-          <w:szCs w:val="18"/>
-        </w:rPr>
-      </w:pPr>
-      <w:r>
-        <w:rPr>
-          <w:rStyle w:val="15"/>
-          <w:rFonts w:hint="default" w:ascii="Arial" w:hAnsi="Arial" w:cs="Arial"/>
-          <w:sz w:val="18"/>
-          <w:szCs w:val="18"/>
-        </w:rPr>
-        <w:t>Built automatic output routing to return text answers, data tables, or interactive Plotly charts based on the user question.</w:t>
-      </w:r>
-    </w:p>
-    <w:p>
-      <w:pPr>
-        <w:pStyle w:val="16"/>
-        <w:keepNext w:val="0"/>
-        <w:keepLines w:val="0"/>
-        <w:widowControl/>
-        <w:numPr>
-          <w:ilvl w:val="0"/>
-          <w:numId w:val="2"/>
-        </w:numPr>
-        <w:suppressLineNumbers w:val="0"/>
-        <w:ind w:left="360" w:leftChars="0" w:hanging="240" w:firstLineChars="0"/>
-        <w:rPr>
-          <w:rStyle w:val="15"/>
-          <w:rFonts w:hint="default" w:ascii="Arial" w:hAnsi="Arial" w:cs="Arial"/>
-          <w:sz w:val="18"/>
-          <w:szCs w:val="18"/>
-        </w:rPr>
-      </w:pPr>
-      <w:r>
-        <w:rPr>
-          <w:rStyle w:val="15"/>
-          <w:rFonts w:hint="default" w:ascii="Arial" w:hAnsi="Arial" w:cs="Arial"/>
-          <w:sz w:val="18"/>
-          <w:szCs w:val="18"/>
-        </w:rPr>
-        <w:t>Added SQL safety controls including SELECT-only validation, unknown table/column rejection, row limits, read-only execution, and auto-repair for invalid SQL.</w:t>
-      </w:r>
-    </w:p>
-    <w:p>
-      <w:pPr>
-        <w:pStyle w:val="16"/>
-        <w:keepNext w:val="0"/>
-        <w:keepLines w:val="0"/>
-        <w:widowControl/>
-        <w:numPr>
-          <w:ilvl w:val="0"/>
-          <w:numId w:val="2"/>
-        </w:numPr>
-        <w:suppressLineNumbers w:val="0"/>
-        <w:ind w:left="360" w:leftChars="0" w:hanging="240" w:firstLineChars="0"/>
-        <w:rPr>
           <w:rFonts w:hint="default"/>
           <w:b w:val="0"/>
           <w:bCs w:val="0"/>
@@ -1234,10 +776,21 @@
         <w:rPr>
           <w:rStyle w:val="15"/>
           <w:rFonts w:hint="default" w:ascii="Arial" w:hAnsi="Arial" w:cs="Arial"/>
-          <w:sz w:val="18"/>
-          <w:szCs w:val="18"/>
-        </w:rPr>
-        <w:t xml:space="preserve">GitHub-link: </w:t>
+          <w:b/>
+          <w:bCs/>
+          <w:sz w:val="18"/>
+          <w:szCs w:val="18"/>
+        </w:rPr>
+        <w:t>GitHub</w:t>
+      </w:r>
+      <w:r>
+        <w:rPr>
+          <w:rStyle w:val="15"/>
+          <w:rFonts w:hint="default" w:ascii="Arial" w:hAnsi="Arial" w:cs="Arial"/>
+          <w:sz w:val="18"/>
+          <w:szCs w:val="18"/>
+        </w:rPr>
+        <w:t xml:space="preserve">: </w:t>
       </w:r>
       <w:r>
         <w:rPr>
@@ -1285,6 +838,64 @@
           <w:color w:val="0000FF"/>
           <w:sz w:val="18"/>
           <w:szCs w:val="18"/>
+        </w:rPr>
+        <w:fldChar w:fldCharType="end"/>
+      </w:r>
+      <w:r>
+        <w:rPr>
+          <w:rStyle w:val="15"/>
+          <w:rFonts w:hint="default" w:ascii="Arial" w:hAnsi="Arial" w:cs="Arial"/>
+          <w:sz w:val="18"/>
+          <w:szCs w:val="18"/>
+        </w:rPr>
+        <w:t xml:space="preserve">  |  </w:t>
+      </w:r>
+      <w:r>
+        <w:rPr>
+          <w:rStyle w:val="15"/>
+          <w:rFonts w:hint="default" w:ascii="Arial" w:hAnsi="Arial" w:cs="Arial"/>
+          <w:b/>
+          <w:bCs/>
+          <w:sz w:val="18"/>
+          <w:szCs w:val="18"/>
+        </w:rPr>
+        <w:t>LinkedIn</w:t>
+      </w:r>
+      <w:r>
+        <w:rPr>
+          <w:rStyle w:val="15"/>
+          <w:rFonts w:hint="default" w:ascii="Arial" w:hAnsi="Arial" w:cs="Arial"/>
+          <w:sz w:val="18"/>
+          <w:szCs w:val="18"/>
+        </w:rPr>
+        <w:t xml:space="preserve">: </w:t>
+      </w:r>
+      <w:r>
+        <w:fldChar w:fldCharType="begin"/>
+      </w:r>
+      <w:r>
+        <w:instrText xml:space="preserve"> HYPERLINK "https://www.linkedin.com/posts/mohmad-ayman_i-recently-built-a-data-science-ai-project-activity-7475478244528619520-jmWT?utm_source=social_share_send&amp;utm_medium=member_desktop_web&amp;rcm=ACoAAFQSo7oBQ0jD1RYyh9oqkvFKOjgy4NpgEF4" </w:instrText>
+      </w:r>
+      <w:r>
+        <w:fldChar w:fldCharType="separate"/>
+      </w:r>
+      <w:r>
+        <w:rPr>
+          <w:rFonts w:ascii="Arial" w:hAnsi="Arial" w:cs="Arial"/>
+          <w:color w:val="4F81BD"/>
+          <w:sz w:val="18"/>
+          <w:szCs w:val="18"/>
+          <w:u w:val="single"/>
+        </w:rPr>
+        <w:t>View Post</w:t>
+      </w:r>
+      <w:r>
+        <w:rPr>
+          <w:rFonts w:ascii="Arial" w:hAnsi="Arial" w:cs="Arial"/>
+          <w:color w:val="4F81BD"/>
+          <w:sz w:val="18"/>
+          <w:szCs w:val="18"/>
+          <w:u w:val="single"/>
         </w:rPr>
         <w:fldChar w:fldCharType="end"/>
       </w:r>
@@ -1371,7 +982,7 @@
             </w14:solidFill>
           </w14:textFill>
         </w:rPr>
-        <w:t>Python, PyTorch, U-Net, Attention U-Net, U-Net++, TransUNet-style Hybrid, NumPy, Pillow, Matplotlib, Streamlit</w:t>
+        <w:t>Python, PyTorch, U-Net, Attention U-Net, U-Net++, TransUNet-style Hybrid, Streamlit</w:t>
       </w:r>
     </w:p>
     <w:p>
@@ -1393,7 +1004,7 @@
           <w:sz w:val="18"/>
           <w:szCs w:val="18"/>
         </w:rPr>
-        <w:t>Built a medical image segmentation project to compare multiple U-Net-style architectures on the Kvasir-SEG polyp segmentation dataset.</w:t>
+        <w:t>Built a consistent Kvasir-SEG workflow to train and fairly compare four U-Net-style segmentation models.</w:t>
       </w:r>
     </w:p>
     <w:p>
@@ -1415,7 +1026,7 @@
           <w:sz w:val="18"/>
           <w:szCs w:val="18"/>
         </w:rPr>
-        <w:t>Implemented a consistent notebook-based workflow for dataset download, preprocessing, training, evaluation, and prediction visualization.</w:t>
+        <w:t>Evaluated the models using Dice and IoU, reaching a best validation Dice of 0.793 and IoU of 0.686 by epoch 22.</w:t>
       </w:r>
     </w:p>
     <w:p>
@@ -1437,7 +1048,7 @@
           <w:sz w:val="18"/>
           <w:szCs w:val="18"/>
         </w:rPr>
-        <w:t>Trained and compared U-Net, Attention U-Net, U-Net++, and a compact TransUNet-style hybrid using the same validation split, image size, batch size, epochs, early stopping, and metrics.</w:t>
+        <w:t>Developed a Streamlit viewer for comparing prediction overlays, probability maps, and model-voting results.</w:t>
       </w:r>
     </w:p>
     <w:p>
@@ -1456,76 +1067,20 @@
       <w:r>
         <w:rPr>
           <w:rFonts w:hint="default"/>
-          <w:sz w:val="18"/>
-          <w:szCs w:val="18"/>
-        </w:rPr>
-        <w:t>Evaluated segmentation quality using Dice Score, IoU, and BCEWithLogitsLoss + Dice Loss instead of relying only on pixel accuracy.</w:t>
-      </w:r>
-    </w:p>
-    <w:p>
-      <w:pPr>
-        <w:numPr>
-          <w:ilvl w:val="0"/>
-          <w:numId w:val="2"/>
-        </w:numPr>
-        <w:bidi w:val="0"/>
+          <w:b/>
+          <w:bCs/>
+          <w:sz w:val="18"/>
+          <w:szCs w:val="18"/>
+        </w:rPr>
+        <w:t>GitHub</w:t>
+      </w:r>
+      <w:r>
         <w:rPr>
           <w:rFonts w:hint="default"/>
           <w:sz w:val="18"/>
           <w:szCs w:val="18"/>
         </w:rPr>
-      </w:pPr>
-      <w:r>
-        <w:rPr>
-          <w:rFonts w:hint="default"/>
-          <w:sz w:val="18"/>
-          <w:szCs w:val="18"/>
-        </w:rPr>
-        <w:t>Built a model comparison workflow and Streamlit viewer to upload images and compare prediction overlays, probability maps, and voting masks across models.</w:t>
-      </w:r>
-    </w:p>
-    <w:p>
-      <w:pPr>
-        <w:numPr>
-          <w:ilvl w:val="0"/>
-          <w:numId w:val="2"/>
-        </w:numPr>
-        <w:bidi w:val="0"/>
-        <w:rPr>
-          <w:rFonts w:hint="default"/>
-          <w:sz w:val="18"/>
-          <w:szCs w:val="18"/>
-        </w:rPr>
-      </w:pPr>
-      <w:r>
-        <w:rPr>
-          <w:rFonts w:hint="default"/>
-          <w:sz w:val="18"/>
-          <w:szCs w:val="18"/>
-        </w:rPr>
-        <w:t>Organized reusable code for dataset loading, training, metrics, evaluation, prediction, and visualization inside a clean src structure.</w:t>
-      </w:r>
-    </w:p>
-    <w:p>
-      <w:pPr>
-        <w:numPr>
-          <w:ilvl w:val="0"/>
-          <w:numId w:val="2"/>
-        </w:numPr>
-        <w:bidi w:val="0"/>
-        <w:rPr>
-          <w:rFonts w:hint="default"/>
-          <w:sz w:val="18"/>
-          <w:szCs w:val="18"/>
-        </w:rPr>
-      </w:pPr>
-      <w:r>
-        <w:rPr>
-          <w:rFonts w:hint="default"/>
-          <w:sz w:val="18"/>
-          <w:szCs w:val="18"/>
-        </w:rPr>
-        <w:t xml:space="preserve">GitHub-link: </w:t>
+        <w:t xml:space="preserve">: </w:t>
       </w:r>
       <w:r>
         <w:rPr>
@@ -1540,6 +1095,61 @@
           </w14:textFill>
         </w:rPr>
         <w:t>https://github.com/mohmadAyman75/kvasir-seg-multi-unet-comparison</w:t>
+      </w:r>
+      <w:r>
+        <w:rPr>
+          <w:rFonts w:hint="default"/>
+          <w:sz w:val="18"/>
+          <w:szCs w:val="18"/>
+        </w:rPr>
+        <w:t xml:space="preserve">  |  </w:t>
+      </w:r>
+      <w:r>
+        <w:rPr>
+          <w:rFonts w:hint="default"/>
+          <w:b/>
+          <w:bCs/>
+          <w:sz w:val="18"/>
+          <w:szCs w:val="18"/>
+        </w:rPr>
+        <w:t>LinkedIn</w:t>
+      </w:r>
+      <w:r>
+        <w:rPr>
+          <w:rFonts w:hint="default"/>
+          <w:sz w:val="18"/>
+          <w:szCs w:val="18"/>
+        </w:rPr>
+        <w:t xml:space="preserve">: </w:t>
+      </w:r>
+      <w:r>
+        <w:fldChar w:fldCharType="begin"/>
+      </w:r>
+      <w:r>
+        <w:instrText xml:space="preserve"> HYPERLINK "https://www.linkedin.com/posts/mohmad-ayman_i-recently-built-a-deep-learning-project-activity-7475030591529426944-prDU?utm_source=social_share_send&amp;utm_medium=member_desktop_web&amp;rcm=ACoAAFQSo7oBQ0jD1RYyh9oqkvFKOjgy4NpgEF4" </w:instrText>
+      </w:r>
+      <w:r>
+        <w:fldChar w:fldCharType="separate"/>
+      </w:r>
+      <w:r>
+        <w:rPr>
+          <w:rFonts w:ascii="Arial" w:hAnsi="Arial" w:cs="Arial"/>
+          <w:color w:val="4F81BD"/>
+          <w:sz w:val="18"/>
+          <w:szCs w:val="18"/>
+          <w:u w:val="single"/>
+        </w:rPr>
+        <w:t>View Post</w:t>
+      </w:r>
+      <w:r>
+        <w:rPr>
+          <w:rFonts w:ascii="Arial" w:hAnsi="Arial" w:cs="Arial"/>
+          <w:color w:val="4F81BD"/>
+          <w:sz w:val="18"/>
+          <w:szCs w:val="18"/>
+          <w:u w:val="single"/>
+        </w:rPr>
+        <w:fldChar w:fldCharType="end"/>
       </w:r>
     </w:p>
     <w:p>
@@ -1614,8 +1224,8 @@
           <w:b w:val="0"/>
           <w:bCs w:val="0"/>
           <w:color w:val="4F81BD" w:themeColor="accent1"/>
-          <w:sz w:val="16"/>
-          <w:szCs w:val="16"/>
+          <w:sz w:val="18"/>
+          <w:szCs w:val="18"/>
           <w:lang w:val="en-US"/>
           <w14:textFill>
             <w14:solidFill>
@@ -1623,40 +1233,7 @@
             </w14:solidFill>
           </w14:textFill>
         </w:rPr>
-        <w:t>T</w:t>
-      </w:r>
-      <w:r>
-        <w:rPr>
-          <w:rFonts w:hint="default"/>
-          <w:b w:val="0"/>
-          <w:bCs w:val="0"/>
-          <w:color w:val="4F81BD" w:themeColor="accent1"/>
-          <w:sz w:val="18"/>
-          <w:szCs w:val="18"/>
-          <w:lang w:val="en-US"/>
-          <w14:textFill>
-            <w14:solidFill>
-              <w14:schemeClr w14:val="accent1"/>
-            </w14:solidFill>
-          </w14:textFill>
-        </w:rPr>
-        <w:t>ensorFlow, Transformers (AraBERT), Flask, Scikit-learn ,</w:t>
-      </w:r>
-      <w:r>
-        <w:rPr>
-          <w:rFonts w:hint="default" w:cs="Arial"/>
-          <w:color w:val="4F81BD" w:themeColor="accent1"/>
-          <w:sz w:val="18"/>
-          <w:szCs w:val="18"/>
-          <w:rtl w:val="0"/>
-          <w:lang w:val="en-US" w:bidi="ar-SA"/>
-          <w14:textFill>
-            <w14:solidFill>
-              <w14:schemeClr w14:val="accent1"/>
-            </w14:solidFill>
-          </w14:textFill>
-        </w:rPr>
-        <w:t>Llama-Index, LLM</w:t>
+        <w:t>TensorFlow, Transformers (AraBERT), Flask, Scikit-learn, LlamaIndex, LLM</w:t>
       </w:r>
     </w:p>
     <w:p>
@@ -1684,7 +1261,7 @@
           <w:sz w:val="18"/>
           <w:szCs w:val="18"/>
         </w:rPr>
-        <w:t>My role: BERT-based safety classifier, Arabic data collection, project planning, and RAG pipeline implementation using LlamaIndex</w:t>
+        <w:t>Fine-tuned AraBERT and BERT models to classify patient queries into Low, Medium, or High safety risk.</w:t>
       </w:r>
     </w:p>
     <w:p>
@@ -1715,7 +1292,7 @@
           <w:szCs w:val="18"/>
           <w:lang w:val="en-US"/>
         </w:rPr>
-        <w:t>Fine-tuned AraBERT and BERT models to classify patient queries into Low / Medium / High safety risk (e.g., potential drug misuse or contraindications).</w:t>
+        <w:t>Built a Flask /predict API and curated Arabic safety data for training and evaluation.</w:t>
       </w:r>
     </w:p>
     <w:p>
@@ -1746,7 +1323,7 @@
           <w:szCs w:val="18"/>
           <w:lang w:val="en-US"/>
         </w:rPr>
-        <w:t>Built a Flask API endpoint `/predict` serving the safety model in real time.</w:t>
+        <w:t>Integrated the safety model into the team's RAG pipeline and achieved 92% F1-score on a held-out test set.</w:t>
       </w:r>
     </w:p>
     <w:p>
@@ -1758,118 +1335,26 @@
         <w:spacing w:before="80" w:after="0"/>
         <w:ind w:left="360" w:leftChars="0" w:hanging="240" w:firstLineChars="0"/>
         <w:rPr>
+          <w:rStyle w:val="17"/>
           <w:rFonts w:hint="default"/>
-          <w:b w:val="0"/>
-          <w:bCs w:val="0"/>
-          <w:color w:val="1C1C1C"/>
-          <w:sz w:val="18"/>
-          <w:szCs w:val="18"/>
+          <w:sz w:val="20"/>
+          <w:szCs w:val="20"/>
+          <w:rtl w:val="0"/>
           <w:lang w:val="en-US"/>
         </w:rPr>
       </w:pPr>
       <w:r>
         <w:rPr>
-          <w:rFonts w:hint="default"/>
-          <w:b w:val="0"/>
-          <w:bCs w:val="0"/>
-          <w:color w:val="1C1C1C"/>
-          <w:sz w:val="18"/>
-          <w:szCs w:val="18"/>
-          <w:lang w:val="en-US"/>
-        </w:rPr>
-        <w:t>Curated and labeled Arabic safety data for training and evaluation.</w:t>
-      </w:r>
-    </w:p>
-    <w:p>
-      <w:pPr>
-        <w:numPr>
-          <w:ilvl w:val="0"/>
-          <w:numId w:val="2"/>
-        </w:numPr>
-        <w:spacing w:before="80" w:after="0"/>
-        <w:ind w:left="360" w:leftChars="0" w:hanging="240" w:firstLineChars="0"/>
-        <w:rPr>
-          <w:rFonts w:hint="default"/>
-          <w:b w:val="0"/>
-          <w:bCs w:val="0"/>
-          <w:color w:val="1C1C1C"/>
-          <w:sz w:val="18"/>
-          <w:szCs w:val="18"/>
-          <w:lang w:val="en-US"/>
-        </w:rPr>
-      </w:pPr>
-      <w:r>
-        <w:rPr>
-          <w:rFonts w:hint="default"/>
-          <w:b w:val="0"/>
-          <w:bCs w:val="0"/>
-          <w:color w:val="1C1C1C"/>
-          <w:sz w:val="18"/>
-          <w:szCs w:val="18"/>
-          <w:lang w:val="en-US"/>
-        </w:rPr>
-        <w:t>Integrated the safety model into the team’s overall RAG pipeline (led by teammate).</w:t>
-      </w:r>
-    </w:p>
-    <w:p>
-      <w:pPr>
-        <w:numPr>
-          <w:ilvl w:val="0"/>
-          <w:numId w:val="2"/>
-        </w:numPr>
-        <w:spacing w:before="80" w:after="0"/>
-        <w:ind w:left="360" w:leftChars="0" w:hanging="240" w:firstLineChars="0"/>
-        <w:rPr>
           <w:rFonts w:hint="default" w:cs="Arial"/>
+          <w:b/>
+          <w:bCs/>
           <w:color w:val="1C1C1C"/>
           <w:sz w:val="18"/>
           <w:szCs w:val="18"/>
           <w:rtl w:val="0"/>
           <w:lang w:val="en-US" w:bidi="ar-SA"/>
         </w:rPr>
-      </w:pPr>
-      <w:r>
-        <w:rPr>
-          <w:rFonts w:hint="default"/>
-          <w:b w:val="0"/>
-          <w:bCs w:val="0"/>
-          <w:color w:val="1C1C1C"/>
-          <w:sz w:val="18"/>
-          <w:szCs w:val="18"/>
-          <w:lang w:val="en-US"/>
-        </w:rPr>
-        <w:t>Achieved 92% F1-score on held-out safety test set.</w:t>
-      </w:r>
-    </w:p>
-    <w:p>
-      <w:pPr>
-        <w:numPr>
-          <w:ilvl w:val="0"/>
-          <w:numId w:val="2"/>
-        </w:numPr>
-        <w:spacing w:before="80" w:after="0"/>
-        <w:ind w:left="360" w:leftChars="0" w:hanging="240" w:firstLineChars="0"/>
-        <w:rPr>
-          <w:rStyle w:val="17"/>
-          <w:rFonts w:hint="default"/>
-          <w:sz w:val="20"/>
-          <w:szCs w:val="20"/>
-          <w:rtl w:val="0"/>
-          <w:lang w:val="en-US"/>
-        </w:rPr>
-      </w:pPr>
-      <w:r>
-        <w:rPr>
-          <w:rFonts w:hint="default" w:cs="Arial"/>
-          <w:b/>
-          <w:bCs/>
-          <w:color w:val="1C1C1C"/>
-          <w:sz w:val="18"/>
-          <w:szCs w:val="18"/>
-          <w:rtl w:val="0"/>
-          <w:lang w:val="en-US" w:bidi="ar-SA"/>
-        </w:rPr>
-        <w:t>GitHub-link</w:t>
+        <w:t>GitHub</w:t>
       </w:r>
       <w:r>
         <w:rPr>
@@ -1898,6 +1383,70 @@
         </w:rPr>
         <w:t>https://github.com/AMRYB/MedChat</w:t>
       </w:r>
+      <w:r>
+        <w:rPr>
+          <w:rFonts w:hint="default" w:cs="Arial"/>
+          <w:color w:val="1C1C1C"/>
+          <w:sz w:val="18"/>
+          <w:szCs w:val="18"/>
+          <w:rtl w:val="0"/>
+          <w:lang w:val="en-US" w:bidi="ar-SA"/>
+        </w:rPr>
+        <w:t xml:space="preserve">  |  </w:t>
+      </w:r>
+      <w:r>
+        <w:rPr>
+          <w:rFonts w:hint="default" w:cs="Arial"/>
+          <w:b/>
+          <w:bCs/>
+          <w:color w:val="1C1C1C"/>
+          <w:sz w:val="18"/>
+          <w:szCs w:val="18"/>
+          <w:rtl w:val="0"/>
+          <w:lang w:val="en-US" w:bidi="ar-SA"/>
+        </w:rPr>
+        <w:t>LinkedIn</w:t>
+      </w:r>
+      <w:r>
+        <w:rPr>
+          <w:rFonts w:hint="default" w:cs="Arial"/>
+          <w:color w:val="1C1C1C"/>
+          <w:sz w:val="18"/>
+          <w:szCs w:val="18"/>
+          <w:rtl w:val="0"/>
+          <w:lang w:val="en-US" w:bidi="ar-SA"/>
+        </w:rPr>
+        <w:t xml:space="preserve">: </w:t>
+      </w:r>
+      <w:r>
+        <w:fldChar w:fldCharType="begin"/>
+      </w:r>
+      <w:r>
+        <w:instrText xml:space="preserve"> HYPERLINK "https://www.linkedin.com/posts/mohmad-ayman_artificialintelligence-deeplearning-rag-activity-7461117645178855424-0FJH?utm_source=social_share_send&amp;utm_medium=member_desktop_web&amp;rcm=ACoAAFQSo7oBQ0jD1RYyh9oqkvFKOjgy4NpgEF4" </w:instrText>
+      </w:r>
+      <w:r>
+        <w:fldChar w:fldCharType="separate"/>
+      </w:r>
+      <w:r>
+        <w:rPr>
+          <w:rFonts w:ascii="Arial" w:hAnsi="Arial" w:cs="Arial"/>
+          <w:color w:val="4F81BD"/>
+          <w:sz w:val="18"/>
+          <w:szCs w:val="18"/>
+          <w:u w:val="single"/>
+        </w:rPr>
+        <w:t>View Post</w:t>
+      </w:r>
+      <w:r>
+        <w:rPr>
+          <w:rFonts w:ascii="Arial" w:hAnsi="Arial" w:cs="Arial"/>
+          <w:color w:val="4F81BD"/>
+          <w:sz w:val="18"/>
+          <w:szCs w:val="18"/>
+          <w:u w:val="single"/>
+        </w:rPr>
+        <w:fldChar w:fldCharType="end"/>
+      </w:r>
     </w:p>
     <w:p>
       <w:pPr>
@@ -1919,16 +1468,22 @@
       </w:r>
     </w:p>
     <w:p>
-      <w:r>
-        <w:rPr>
-          <w:rFonts w:ascii="Arial" w:hAnsi="Arial" w:eastAsia="Arial" w:cs="Arial"/>
-          <w:b/>
-          <w:bCs/>
-          <w:color w:val="1C1C1C"/>
-          <w:sz w:val="21"/>
-          <w:szCs w:val="21"/>
-        </w:rPr>
-        <w:t>NVQ Level 3: Data Science</w:t>
+      <w:pPr>
+        <w:rPr>
+          <w:rFonts w:hint="default" w:ascii="Arial" w:hAnsi="Arial" w:cs="Arial"/>
+          <w:b/>
+          <w:bCs/>
+        </w:rPr>
+      </w:pPr>
+      <w:r>
+        <w:rPr>
+          <w:rFonts w:hint="default" w:ascii="Arial" w:hAnsi="Arial" w:eastAsia="SimSun" w:cs="Arial"/>
+          <w:b/>
+          <w:bCs/>
+          <w:sz w:val="24"/>
+          <w:szCs w:val="24"/>
+        </w:rPr>
+        <w:t>B.Sc. in Computer Science – Data Science Track</w:t>
       </w:r>
     </w:p>
     <w:p>
@@ -1954,113 +1509,13 @@
       </w:r>
       <w:r>
         <w:rPr>
-          <w:rFonts w:hint="cs" w:cs="Arial"/>
+          <w:rFonts w:hint="default" w:cs="Arial"/>
           <w:color w:val="555555"/>
           <w:sz w:val="20"/>
           <w:szCs w:val="20"/>
-          <w:rtl/>
-          <w:lang w:val="en-US" w:bidi="ar-EG"/>
-        </w:rPr>
-        <w:tab/>
-      </w:r>
-      <w:r>
-        <w:rPr>
-          <w:rFonts w:hint="cs" w:cs="Arial"/>
-          <w:color w:val="555555"/>
-          <w:sz w:val="20"/>
-          <w:szCs w:val="20"/>
-          <w:rtl/>
-          <w:lang w:val="en-US" w:bidi="ar-EG"/>
-        </w:rPr>
-        <w:tab/>
-      </w:r>
-      <w:r>
-        <w:rPr>
-          <w:rFonts w:hint="cs" w:cs="Arial"/>
-          <w:color w:val="555555"/>
-          <w:sz w:val="20"/>
-          <w:szCs w:val="20"/>
-          <w:rtl/>
-          <w:lang w:val="en-US" w:bidi="ar-EG"/>
-        </w:rPr>
-        <w:tab/>
-      </w:r>
-      <w:r>
-        <w:rPr>
-          <w:rFonts w:hint="cs" w:cs="Arial"/>
-          <w:color w:val="555555"/>
-          <w:sz w:val="20"/>
-          <w:szCs w:val="20"/>
-          <w:rtl/>
-          <w:lang w:val="en-US" w:bidi="ar-EG"/>
-        </w:rPr>
-        <w:tab/>
-      </w:r>
-      <w:r>
-        <w:rPr>
-          <w:rFonts w:hint="cs" w:cs="Arial"/>
-          <w:color w:val="555555"/>
-          <w:sz w:val="20"/>
-          <w:szCs w:val="20"/>
-          <w:rtl/>
-          <w:lang w:val="en-US" w:bidi="ar-EG"/>
-        </w:rPr>
-        <w:tab/>
-      </w:r>
-      <w:r>
-        <w:rPr>
-          <w:rFonts w:hint="cs" w:cs="Arial"/>
-          <w:color w:val="555555"/>
-          <w:sz w:val="20"/>
-          <w:szCs w:val="20"/>
-          <w:rtl/>
-          <w:lang w:val="en-US" w:bidi="ar-EG"/>
-        </w:rPr>
-        <w:tab/>
-      </w:r>
-      <w:r>
-        <w:rPr>
-          <w:rFonts w:hint="cs" w:cs="Arial"/>
-          <w:color w:val="555555"/>
-          <w:sz w:val="20"/>
-          <w:szCs w:val="20"/>
-          <w:rtl/>
-          <w:lang w:val="en-US" w:bidi="ar-EG"/>
-        </w:rPr>
-        <w:tab/>
-      </w:r>
-      <w:r>
-        <w:rPr>
-          <w:rFonts w:hint="cs" w:cs="Arial"/>
-          <w:color w:val="555555"/>
-          <w:sz w:val="20"/>
-          <w:szCs w:val="20"/>
-          <w:rtl/>
-          <w:lang w:val="en-US" w:bidi="ar-EG"/>
-        </w:rPr>
-        <w:tab/>
-      </w:r>
-      <w:r>
-        <w:rPr>
-          <w:rFonts w:hint="cs" w:cs="Arial"/>
-          <w:color w:val="555555"/>
-          <w:sz w:val="20"/>
-          <w:szCs w:val="20"/>
-          <w:rtl/>
-          <w:lang w:val="en-US" w:bidi="ar-EG"/>
-        </w:rPr>
-        <w:tab/>
-      </w:r>
-      <w:r>
-        <w:rPr>
-          <w:rFonts w:hint="cs" w:cs="Arial"/>
-          <w:color w:val="555555"/>
-          <w:sz w:val="20"/>
-          <w:szCs w:val="20"/>
-          <w:rtl/>
-          <w:lang w:val="en-US" w:bidi="ar-EG"/>
-        </w:rPr>
-        <w:tab/>
+          <w:lang w:val="en-US"/>
+        </w:rPr>
+        <w:t xml:space="preserve"> | </w:t>
       </w:r>
       <w:r>
         <w:rPr>
@@ -2071,9 +1526,37 @@
           <w:sz w:val="18"/>
           <w:szCs w:val="18"/>
         </w:rPr>
-        <w:t>01/2024 – Current</w:t>
-      </w:r>
-      <w:r>
+        <w:t xml:space="preserve">01/2024 – </w:t>
+      </w:r>
+      <w:r>
+        <w:rPr>
+          <w:rFonts w:hint="default" w:ascii="Arial" w:hAnsi="Arial" w:eastAsia="SimSun" w:cs="Arial"/>
+          <w:sz w:val="20"/>
+          <w:szCs w:val="20"/>
+        </w:rPr>
+        <w:t>Present</w:t>
+      </w:r>
+      <w:r>
+        <w:rPr>
+          <w:rFonts w:hint="default" w:eastAsia="SimSun" w:cs="Arial"/>
+          <w:sz w:val="20"/>
+          <w:szCs w:val="20"/>
+          <w:lang w:val="en-US"/>
+        </w:rPr>
+        <w:t xml:space="preserve"> | </w:t>
+      </w:r>
+      <w:r>
+        <w:rPr>
+          <w:rFonts w:ascii="SimSun" w:hAnsi="SimSun" w:eastAsia="SimSun" w:cs="SimSun"/>
+          <w:sz w:val="24"/>
+          <w:szCs w:val="24"/>
+        </w:rPr>
+        <w:t>Expected Graduation: 2027</w:t>
+      </w:r>
+    </w:p>
+    <w:p>
+      <w:pPr>
+        <w:spacing w:before="80" w:after="0"/>
         <w:rPr>
           <w:rFonts w:hint="cs" w:cs="Arial"/>
           <w:color w:val="555555"/>
@@ -2082,7 +1565,15 @@
           <w:rtl/>
           <w:lang w:val="en-US" w:bidi="ar-EG"/>
         </w:rPr>
-        <w:tab/>
+      </w:pPr>
+      <w:r>
+        <w:rPr>
+          <w:rFonts w:ascii="Arial" w:hAnsi="Arial" w:eastAsia="Arial" w:cs="Arial"/>
+          <w:color w:val="555555"/>
+          <w:sz w:val="20"/>
+          <w:szCs w:val="20"/>
+        </w:rPr>
+        <w:t>CGPA: 3.3</w:t>
       </w:r>
     </w:p>
     <w:p>
@@ -2199,15 +1690,7 @@
           <w:sz w:val="18"/>
           <w:szCs w:val="18"/>
         </w:rPr>
-        <w:t>•</w:t>
-      </w:r>
-      <w:r>
-        <w:rPr>
-          <w:rFonts w:hint="default" w:ascii="Arial" w:hAnsi="Arial" w:eastAsia="SimSun" w:cs="Arial"/>
-          <w:sz w:val="18"/>
-          <w:szCs w:val="18"/>
-        </w:rPr>
-        <w:t xml:space="preserve"> </w:t>
+        <w:t xml:space="preserve">• </w:t>
       </w:r>
       <w:r>
         <w:rPr>
@@ -2561,7 +2044,7 @@
     </w:p>
     <w:p>
       <w:pPr>
-        <w:pStyle w:val="20"/>
+        <w:pStyle w:val="21"/>
         <w:numPr>
           <w:ilvl w:val="0"/>
           <w:numId w:val="2"/>
@@ -2670,19 +2153,10 @@
         </w:rPr>
         <w:tab/>
       </w:r>
-      <w:r>
-        <w:rPr>
-          <w:rFonts w:ascii="Arial" w:hAnsi="Arial" w:eastAsia="Arial" w:cs="Arial"/>
-          <w:color w:val="1C1C1C"/>
-          <w:sz w:val="20"/>
-          <w:szCs w:val="20"/>
-        </w:rPr>
-        <w:t>Intro to AI — BUE</w:t>
-      </w:r>
-    </w:p>
-    <w:p>
-      <w:pPr>
-        <w:pStyle w:val="20"/>
+    </w:p>
+    <w:p>
+      <w:pPr>
+        <w:pStyle w:val="21"/>
         <w:numPr>
           <w:ilvl w:val="0"/>
           <w:numId w:val="1"/>
@@ -2696,7 +2170,15 @@
           <w:sz w:val="20"/>
           <w:szCs w:val="20"/>
         </w:rPr>
-        <w:t>Machine Learning — Nvidia</w:t>
+        <w:t xml:space="preserve">Machine Learning — </w:t>
+      </w:r>
+      <w:r>
+        <w:rPr>
+          <w:rFonts w:hint="default" w:ascii="Arial" w:hAnsi="Arial" w:eastAsia="SimSun" w:cs="Arial"/>
+          <w:sz w:val="18"/>
+          <w:szCs w:val="18"/>
+        </w:rPr>
+        <w:t>NVIDIA</w:t>
       </w:r>
       <w:r>
         <w:rPr>
@@ -2785,15 +2267,6 @@
           <w:lang w:val="en-US" w:bidi="ar-EG"/>
         </w:rPr>
         <w:tab/>
-      </w:r>
-      <w:r>
-        <w:rPr>
-          <w:rFonts w:ascii="Arial" w:hAnsi="Arial" w:eastAsia="Arial" w:cs="Arial"/>
-          <w:color w:val="1C1C1C"/>
-          <w:sz w:val="20"/>
-          <w:szCs w:val="20"/>
-        </w:rPr>
-        <w:t>AI for Business — NTI</w:t>
       </w:r>
     </w:p>
     <w:p>
@@ -2920,7 +2393,7 @@
     </w:p>
     <w:p>
       <w:pPr>
-        <w:pStyle w:val="20"/>
+        <w:pStyle w:val="21"/>
         <w:numPr>
           <w:ilvl w:val="0"/>
           <w:numId w:val="1"/>
@@ -3056,7 +2529,170 @@
     </w:p>
     <w:p>
       <w:pPr>
+        <w:numPr>
+          <w:ilvl w:val="0"/>
+          <w:numId w:val="2"/>
+        </w:numPr>
         <w:spacing w:before="80" w:after="0"/>
+        <w:ind w:left="360" w:leftChars="0" w:hanging="240" w:firstLineChars="0"/>
+        <w:rPr>
+          <w:rFonts w:hint="default" w:ascii="Arial" w:hAnsi="Arial" w:cs="Arial"/>
+          <w:b w:val="0"/>
+          <w:bCs w:val="0"/>
+          <w:sz w:val="20"/>
+          <w:szCs w:val="20"/>
+        </w:rPr>
+      </w:pPr>
+      <w:r>
+        <w:rPr>
+          <w:rFonts w:ascii="Arial" w:hAnsi="Arial" w:eastAsia="Arial" w:cs="Arial"/>
+          <w:color w:val="1C1C1C"/>
+          <w:sz w:val="20"/>
+          <w:szCs w:val="20"/>
+        </w:rPr>
+        <w:t>Intro to AI — BUE</w:t>
+      </w:r>
+    </w:p>
+    <w:p>
+      <w:pPr>
+        <w:numPr>
+          <w:ilvl w:val="0"/>
+          <w:numId w:val="2"/>
+        </w:numPr>
+        <w:spacing w:before="80" w:after="0"/>
+        <w:ind w:left="360" w:leftChars="0" w:hanging="240" w:firstLineChars="0"/>
+        <w:rPr>
+          <w:rFonts w:hint="default" w:ascii="Arial" w:hAnsi="Arial" w:eastAsia="sans-serif" w:cs="Arial"/>
+          <w:b w:val="0"/>
+          <w:bCs w:val="0"/>
+          <w:i w:val="0"/>
+          <w:iCs w:val="0"/>
+          <w:caps w:val="0"/>
+          <w:color w:val="000000"/>
+          <w:spacing w:val="0"/>
+          <w:sz w:val="20"/>
+          <w:szCs w:val="20"/>
+        </w:rPr>
+      </w:pPr>
+      <w:r>
+        <w:rPr>
+          <w:rFonts w:ascii="Arial" w:hAnsi="Arial" w:eastAsia="Arial" w:cs="Arial"/>
+          <w:color w:val="1C1C1C"/>
+          <w:sz w:val="20"/>
+          <w:szCs w:val="20"/>
+        </w:rPr>
+        <w:t>AI for Business — NTI</w:t>
+      </w:r>
+      <w:r>
+        <w:rPr>
+          <w:rFonts w:hint="default" w:cs="Arial"/>
+          <w:color w:val="1C1C1C"/>
+          <w:sz w:val="20"/>
+          <w:szCs w:val="20"/>
+          <w:lang w:val="en-US" w:bidi="ar-SA"/>
+        </w:rPr>
+        <w:t xml:space="preserve"> (02/2026)</w:t>
+      </w:r>
+    </w:p>
+    <w:p>
+      <w:pPr>
+        <w:numPr>
+          <w:ilvl w:val="0"/>
+          <w:numId w:val="2"/>
+        </w:numPr>
+        <w:spacing w:before="80" w:after="0"/>
+        <w:ind w:left="360" w:leftChars="0" w:hanging="240" w:firstLineChars="0"/>
+        <w:rPr>
+          <w:rFonts w:hint="default" w:ascii="Arial" w:hAnsi="Arial" w:eastAsia="sans-serif" w:cs="Arial"/>
+          <w:b w:val="0"/>
+          <w:bCs w:val="0"/>
+          <w:i w:val="0"/>
+          <w:iCs w:val="0"/>
+          <w:caps w:val="0"/>
+          <w:color w:val="000000"/>
+          <w:spacing w:val="0"/>
+          <w:sz w:val="20"/>
+          <w:szCs w:val="20"/>
+        </w:rPr>
+      </w:pPr>
+      <w:r>
+        <w:rPr>
+          <w:rFonts w:hint="default" w:ascii="Arial" w:hAnsi="Arial" w:eastAsia="sans-serif" w:cs="Arial"/>
+          <w:b w:val="0"/>
+          <w:bCs w:val="0"/>
+          <w:i w:val="0"/>
+          <w:iCs w:val="0"/>
+          <w:caps w:val="0"/>
+          <w:color w:val="000000"/>
+          <w:spacing w:val="0"/>
+          <w:sz w:val="20"/>
+          <w:szCs w:val="20"/>
+          <w:shd w:val="clear" w:fill="FFFFFF"/>
+        </w:rPr>
+        <w:t>AI &amp; Data Science - Agentic AI and Generative AI System Developer</w:t>
+      </w:r>
+      <w:r>
+        <w:rPr>
+          <w:rFonts w:hint="default" w:eastAsia="sans-serif" w:cs="Arial"/>
+          <w:b w:val="0"/>
+          <w:bCs w:val="0"/>
+          <w:i w:val="0"/>
+          <w:iCs w:val="0"/>
+          <w:caps w:val="0"/>
+          <w:color w:val="000000"/>
+          <w:spacing w:val="0"/>
+          <w:sz w:val="20"/>
+          <w:szCs w:val="20"/>
+          <w:shd w:val="clear" w:fill="FFFFFF"/>
+          <w:lang w:val="en-US"/>
+        </w:rPr>
+        <w:t xml:space="preserve"> </w:t>
+      </w:r>
+      <w:r>
+        <w:rPr>
+          <w:rFonts w:ascii="Arial" w:hAnsi="Arial" w:eastAsia="Arial" w:cs="Arial"/>
+          <w:color w:val="1C1C1C"/>
+          <w:sz w:val="20"/>
+          <w:szCs w:val="20"/>
+        </w:rPr>
+        <w:t>—</w:t>
+      </w:r>
+      <w:r>
+        <w:rPr>
+          <w:rFonts w:hint="default" w:cs="Arial"/>
+          <w:color w:val="1C1C1C"/>
+          <w:sz w:val="20"/>
+          <w:szCs w:val="20"/>
+          <w:lang w:val="en-US"/>
+        </w:rPr>
+        <w:t xml:space="preserve"> </w:t>
+      </w:r>
+      <w:r>
+        <w:rPr>
+          <w:rFonts w:hint="default" w:eastAsia="sans-serif" w:cs="Arial"/>
+          <w:b w:val="0"/>
+          <w:bCs w:val="0"/>
+          <w:i w:val="0"/>
+          <w:iCs w:val="0"/>
+          <w:caps w:val="0"/>
+          <w:color w:val="000000"/>
+          <w:spacing w:val="0"/>
+          <w:sz w:val="20"/>
+          <w:szCs w:val="20"/>
+          <w:shd w:val="clear" w:fill="FFFFFF"/>
+          <w:lang w:val="en-US"/>
+        </w:rPr>
+        <w:t xml:space="preserve"> DEPI</w:t>
+      </w:r>
+    </w:p>
+    <w:p>
+      <w:pPr>
+        <w:numPr>
+          <w:ilvl w:val="0"/>
+          <w:numId w:val="0"/>
+        </w:numPr>
+        <w:spacing w:before="80" w:after="0"/>
+        <w:ind w:left="120" w:leftChars="0"/>
         <w:rPr>
           <w:rFonts w:ascii="Arial" w:hAnsi="Arial" w:eastAsia="Arial" w:cs="Arial"/>
           <w:color w:val="1C1C1C"/>
@@ -3390,7 +3026,7 @@
   <w:style w:type="paragraph" w:styleId="2">
     <w:name w:val="heading 1"/>
     <w:next w:val="1"/>
-    <w:link w:val="23"/>
+    <w:link w:val="24"/>
     <w:qFormat/>
     <w:uiPriority w:val="0"/>
     <w:rPr>
@@ -3494,7 +3130,7 @@
   </w:style>
   <w:style w:type="paragraph" w:styleId="11">
     <w:name w:val="endnote text"/>
-    <w:link w:val="22"/>
+    <w:link w:val="23"/>
     <w:semiHidden/>
     <w:unhideWhenUsed/>
     <w:qFormat/>
@@ -3531,7 +3167,7 @@
   </w:style>
   <w:style w:type="paragraph" w:styleId="14">
     <w:name w:val="footnote text"/>
-    <w:link w:val="21"/>
+    <w:link w:val="22"/>
     <w:semiHidden/>
     <w:unhideWhenUsed/>
     <w:qFormat/>
@@ -3617,7 +3253,17 @@
       <w:lang w:val="en-US" w:eastAsia="zh-CN" w:bidi="ar"/>
     </w:rPr>
   </w:style>
-  <w:style w:type="paragraph" w:styleId="19">
+  <w:style w:type="character" w:styleId="19">
+    <w:name w:val="Strong"/>
+    <w:basedOn w:val="8"/>
+    <w:qFormat/>
+    <w:uiPriority w:val="0"/>
+    <w:rPr>
+      <w:b/>
+      <w:bCs/>
+    </w:rPr>
+  </w:style>
+  <w:style w:type="paragraph" w:styleId="20">
     <w:name w:val="Title"/>
     <w:qFormat/>
     <w:uiPriority w:val="0"/>
@@ -3628,7 +3274,7 @@
       <w:szCs w:val="56"/>
     </w:rPr>
   </w:style>
-  <w:style w:type="paragraph" w:styleId="20">
+  <w:style w:type="paragraph" w:styleId="21">
     <w:name w:val="List Paragraph"/>
     <w:qFormat/>
     <w:uiPriority w:val="0"/>
@@ -3639,7 +3285,7 @@
       <w:szCs w:val="20"/>
     </w:rPr>
   </w:style>
-  <w:style w:type="character" w:customStyle="1" w:styleId="21">
+  <w:style w:type="character" w:customStyle="1" w:styleId="22">
     <w:name w:val="Footnote Text Char"/>
     <w:link w:val="14"/>
     <w:semiHidden/>
@@ -3651,7 +3297,7 @@
       <w:szCs w:val="20"/>
     </w:rPr>
   </w:style>
-  <w:style w:type="character" w:customStyle="1" w:styleId="22">
+  <w:style w:type="character" w:customStyle="1" w:styleId="23">
     <w:name w:val="Endnote Text Char"/>
     <w:link w:val="11"/>
     <w:semiHidden/>
@@ -3663,7 +3309,7 @@
       <w:szCs w:val="20"/>
     </w:rPr>
   </w:style>
-  <w:style w:type="character" w:customStyle="1" w:styleId="23">
+  <w:style w:type="character" w:customStyle="1" w:styleId="24">
     <w:name w:val="Heading 1 Char"/>
     <w:link w:val="2"/>
     <w:qFormat/>

</xml_diff>